<commit_message>
Weekend Spkie: References added
</commit_message>
<xml_diff>
--- a/Week 1/Weekend/Real_Traffic_100K_Users.docx
+++ b/Week 1/Weekend/Real_Traffic_100K_Users.docx
@@ -199,6 +199,10 @@
     <w:p>
       <w:pPr>
         <w:spacing w:after="140"/>
+        <w:rPr>
+          <w:color w:val="000000"/>
+          <w:lang w:val="en-GB"/>
+        </w:rPr>
       </w:pPr>
       <w:r>
         <w:rPr>
@@ -206,6 +210,93 @@
         </w:rPr>
         <w:t>Without logging and analysis of response times and resource usage under real load, bottlenecks stay invisible until they cause an outage. Continuous monitoring of logs and slow-query data is what turns a guess about where the site will break into an evidence-based fix.</w:t>
       </w:r>
+    </w:p>
+    <w:p>
+      <w:pPr>
+        <w:spacing w:after="140"/>
+        <w:rPr>
+          <w:color w:val="000000"/>
+          <w:lang w:val="en-GB"/>
+        </w:rPr>
+      </w:pPr>
+    </w:p>
+    <w:p>
+      <w:pPr>
+        <w:spacing w:after="140"/>
+        <w:rPr>
+          <w:b/>
+          <w:bCs/>
+          <w:color w:val="000000"/>
+          <w:sz w:val="24"/>
+          <w:szCs w:val="24"/>
+          <w:lang w:val="en-GB"/>
+        </w:rPr>
+      </w:pPr>
+      <w:r>
+        <w:rPr>
+          <w:b/>
+          <w:bCs/>
+          <w:color w:val="000000"/>
+          <w:sz w:val="24"/>
+          <w:szCs w:val="24"/>
+          <w:lang w:val="en-GB"/>
+        </w:rPr>
+        <w:t>Studied From Sources:</w:t>
+      </w:r>
+    </w:p>
+    <w:p>
+      <w:pPr>
+        <w:pStyle w:val="ListParagraph"/>
+        <w:numPr>
+          <w:ilvl w:val="0"/>
+          <w:numId w:val="2"/>
+        </w:numPr>
+        <w:spacing w:after="140"/>
+        <w:rPr>
+          <w:lang w:val="en-GB"/>
+        </w:rPr>
+      </w:pPr>
+      <w:hyperlink r:id="rId5" w:history="1">
+        <w:r>
+          <w:rPr>
+            <w:rStyle w:val="Hyperlink"/>
+            <w:lang w:val="en-GB"/>
+          </w:rPr>
+          <w:t>https://www.crowdhandler.com/blog/website-performance-optimization-a-guide-to-handling-high-traffic-loads</w:t>
+        </w:r>
+      </w:hyperlink>
+    </w:p>
+    <w:p>
+      <w:pPr>
+        <w:pStyle w:val="ListParagraph"/>
+        <w:numPr>
+          <w:ilvl w:val="0"/>
+          <w:numId w:val="2"/>
+        </w:numPr>
+        <w:spacing w:after="140"/>
+        <w:rPr>
+          <w:lang w:val="en-GB"/>
+        </w:rPr>
+      </w:pPr>
+      <w:hyperlink r:id="rId6" w:history="1">
+        <w:r>
+          <w:rPr>
+            <w:rStyle w:val="Hyperlink"/>
+            <w:lang w:val="en-GB"/>
+          </w:rPr>
+          <w:t>https://perennialconsultancy.com/best-practices-for-high-traffic-websites</w:t>
+        </w:r>
+      </w:hyperlink>
+    </w:p>
+    <w:p>
+      <w:pPr>
+        <w:pStyle w:val="ListParagraph"/>
+        <w:spacing w:after="140"/>
+        <w:ind w:left="720"/>
+        <w:rPr>
+          <w:lang w:val="en-GB"/>
+        </w:rPr>
+      </w:pPr>
     </w:p>
     <w:sectPr>
       <w:pgSz w:w="12240" w:h="15840"/>
@@ -220,6 +311,119 @@
 <file path=word/numbering.xml><?xml version="1.0" encoding="utf-8"?>
 <w:numbering xmlns:wpc="http://schemas.microsoft.com/office/word/2010/wordprocessingCanvas" xmlns:cx="http://schemas.microsoft.com/office/drawing/2014/chartex" xmlns:cx1="http://schemas.microsoft.com/office/drawing/2015/9/8/chartex" xmlns:cx2="http://schemas.microsoft.com/office/drawing/2015/10/21/chartex" xmlns:cx3="http://schemas.microsoft.com/office/drawing/2016/5/9/chartex" xmlns:cx4="http://schemas.microsoft.com/office/drawing/2016/5/10/chartex" xmlns:cx5="http://schemas.microsoft.com/office/drawing/2016/5/11/chartex" xmlns:cx6="http://schemas.microsoft.com/office/drawing/2016/5/12/chartex" xmlns:cx7="http://schemas.microsoft.com/office/drawing/2016/5/13/chartex" xmlns:cx8="http://schemas.microsoft.com/office/drawing/2016/5/14/chartex" xmlns:mc="http://schemas.openxmlformats.org/markup-compatibility/2006" xmlns:aink="http://schemas.microsoft.com/office/drawing/2016/ink" xmlns:am3d="http://schemas.microsoft.com/office/drawing/2017/model3d" xmlns:o="urn:schemas-microsoft-com:office:office" xmlns:oel="http://schemas.microsoft.com/office/2019/extlst" xmlns:r="http://schemas.openxmlformats.org/officeDocument/2006/relationships" xmlns:m="http://schemas.openxmlformats.org/officeDocument/2006/math" xmlns:v="urn:schemas-microsoft-com:vml" xmlns:wp14="http://schemas.microsoft.com/office/word/2010/wordprocessingDrawing" xmlns:wp="http://schemas.openxmlformats.org/drawingml/2006/wordprocessingDrawing" xmlns:w10="urn:schemas-microsoft-com:office:word" xmlns:w="http://schemas.openxmlformats.org/wordprocessingml/2006/main" xmlns:w14="http://schemas.microsoft.com/office/word/2010/wordml" xmlns:w15="http://schemas.microsoft.com/office/word/2012/wordml" xmlns:w16cex="http://schemas.microsoft.com/office/word/2018/wordml/cex" xmlns:w16cid="http://schemas.microsoft.com/office/word/2016/wordml/cid" xmlns:w16="http://schemas.microsoft.com/office/word/2018/wordml" xmlns:w16du="http://schemas.microsoft.com/office/word/2023/wordml/word16du" xmlns:w16sdtdh="http://schemas.microsoft.com/office/word/2020/wordml/sdtdatahash" xmlns:w16sdtfl="http://schemas.microsoft.com/office/word/2024/wordml/sdtformatlock" xmlns:w16se="http://schemas.microsoft.com/office/word/2015/wordml/symex" xmlns:wpg="http://schemas.microsoft.com/office/word/2010/wordprocessingGroup" xmlns:wpi="http://schemas.microsoft.com/office/word/2010/wordprocessingInk" xmlns:wne="http://schemas.microsoft.com/office/word/2006/wordml" xmlns:wps="http://schemas.microsoft.com/office/word/2010/wordprocessingShape" mc:Ignorable="w14 w15 w16se w16cid w16 w16cex w16sdtdh w16sdtfl w16du wp14">
   <w:abstractNum w:abstractNumId="0" w15:restartNumberingAfterBreak="0">
+    <w:nsid w:val="0CEA28B1"/>
+    <w:multiLevelType w:val="hybridMultilevel"/>
+    <w:tmpl w:val="8A2085A0"/>
+    <w:lvl w:ilvl="0" w:tplc="10000001">
+      <w:start w:val="1"/>
+      <w:numFmt w:val="bullet"/>
+      <w:lvlText w:val=""/>
+      <w:lvlJc w:val="left"/>
+      <w:pPr>
+        <w:ind w:left="720" w:hanging="360"/>
+      </w:pPr>
+      <w:rPr>
+        <w:rFonts w:ascii="Symbol" w:hAnsi="Symbol" w:hint="default"/>
+      </w:rPr>
+    </w:lvl>
+    <w:lvl w:ilvl="1" w:tplc="10000003" w:tentative="1">
+      <w:start w:val="1"/>
+      <w:numFmt w:val="bullet"/>
+      <w:lvlText w:val="o"/>
+      <w:lvlJc w:val="left"/>
+      <w:pPr>
+        <w:ind w:left="1440" w:hanging="360"/>
+      </w:pPr>
+      <w:rPr>
+        <w:rFonts w:ascii="Courier New" w:hAnsi="Courier New" w:cs="Courier New" w:hint="default"/>
+      </w:rPr>
+    </w:lvl>
+    <w:lvl w:ilvl="2" w:tplc="10000005" w:tentative="1">
+      <w:start w:val="1"/>
+      <w:numFmt w:val="bullet"/>
+      <w:lvlText w:val=""/>
+      <w:lvlJc w:val="left"/>
+      <w:pPr>
+        <w:ind w:left="2160" w:hanging="360"/>
+      </w:pPr>
+      <w:rPr>
+        <w:rFonts w:ascii="Wingdings" w:hAnsi="Wingdings" w:hint="default"/>
+      </w:rPr>
+    </w:lvl>
+    <w:lvl w:ilvl="3" w:tplc="10000001" w:tentative="1">
+      <w:start w:val="1"/>
+      <w:numFmt w:val="bullet"/>
+      <w:lvlText w:val=""/>
+      <w:lvlJc w:val="left"/>
+      <w:pPr>
+        <w:ind w:left="2880" w:hanging="360"/>
+      </w:pPr>
+      <w:rPr>
+        <w:rFonts w:ascii="Symbol" w:hAnsi="Symbol" w:hint="default"/>
+      </w:rPr>
+    </w:lvl>
+    <w:lvl w:ilvl="4" w:tplc="10000003" w:tentative="1">
+      <w:start w:val="1"/>
+      <w:numFmt w:val="bullet"/>
+      <w:lvlText w:val="o"/>
+      <w:lvlJc w:val="left"/>
+      <w:pPr>
+        <w:ind w:left="3600" w:hanging="360"/>
+      </w:pPr>
+      <w:rPr>
+        <w:rFonts w:ascii="Courier New" w:hAnsi="Courier New" w:cs="Courier New" w:hint="default"/>
+      </w:rPr>
+    </w:lvl>
+    <w:lvl w:ilvl="5" w:tplc="10000005" w:tentative="1">
+      <w:start w:val="1"/>
+      <w:numFmt w:val="bullet"/>
+      <w:lvlText w:val=""/>
+      <w:lvlJc w:val="left"/>
+      <w:pPr>
+        <w:ind w:left="4320" w:hanging="360"/>
+      </w:pPr>
+      <w:rPr>
+        <w:rFonts w:ascii="Wingdings" w:hAnsi="Wingdings" w:hint="default"/>
+      </w:rPr>
+    </w:lvl>
+    <w:lvl w:ilvl="6" w:tplc="10000001" w:tentative="1">
+      <w:start w:val="1"/>
+      <w:numFmt w:val="bullet"/>
+      <w:lvlText w:val=""/>
+      <w:lvlJc w:val="left"/>
+      <w:pPr>
+        <w:ind w:left="5040" w:hanging="360"/>
+      </w:pPr>
+      <w:rPr>
+        <w:rFonts w:ascii="Symbol" w:hAnsi="Symbol" w:hint="default"/>
+      </w:rPr>
+    </w:lvl>
+    <w:lvl w:ilvl="7" w:tplc="10000003" w:tentative="1">
+      <w:start w:val="1"/>
+      <w:numFmt w:val="bullet"/>
+      <w:lvlText w:val="o"/>
+      <w:lvlJc w:val="left"/>
+      <w:pPr>
+        <w:ind w:left="5760" w:hanging="360"/>
+      </w:pPr>
+      <w:rPr>
+        <w:rFonts w:ascii="Courier New" w:hAnsi="Courier New" w:cs="Courier New" w:hint="default"/>
+      </w:rPr>
+    </w:lvl>
+    <w:lvl w:ilvl="8" w:tplc="10000005" w:tentative="1">
+      <w:start w:val="1"/>
+      <w:numFmt w:val="bullet"/>
+      <w:lvlText w:val=""/>
+      <w:lvlJc w:val="left"/>
+      <w:pPr>
+        <w:ind w:left="6480" w:hanging="360"/>
+      </w:pPr>
+      <w:rPr>
+        <w:rFonts w:ascii="Wingdings" w:hAnsi="Wingdings" w:hint="default"/>
+      </w:rPr>
+    </w:lvl>
+  </w:abstractNum>
+  <w:abstractNum w:abstractNumId="1" w15:restartNumberingAfterBreak="0">
     <w:nsid w:val="47BD624B"/>
     <w:multiLevelType w:val="hybridMultilevel"/>
     <w:tmpl w:val="6526009E"/>
@@ -306,10 +510,13 @@
     </w:lvl>
   </w:abstractNum>
   <w:num w:numId="1" w16cid:durableId="25108627">
-    <w:abstractNumId w:val="0"/>
+    <w:abstractNumId w:val="1"/>
     <w:lvlOverride w:ilvl="0">
       <w:startOverride w:val="1"/>
     </w:lvlOverride>
+  </w:num>
+  <w:num w:numId="2" w16cid:durableId="920792897">
+    <w:abstractNumId w:val="0"/>
   </w:num>
 </w:numbering>
 </file>
@@ -901,6 +1108,18 @@
       <w:szCs w:val="20"/>
     </w:rPr>
   </w:style>
+  <w:style w:type="character" w:styleId="UnresolvedMention">
+    <w:name w:val="Unresolved Mention"/>
+    <w:basedOn w:val="DefaultParagraphFont"/>
+    <w:uiPriority w:val="99"/>
+    <w:semiHidden/>
+    <w:unhideWhenUsed/>
+    <w:rsid w:val="00A93625"/>
+    <w:rPr>
+      <w:color w:val="605E5C"/>
+      <w:shd w:val="clear" w:color="auto" w:fill="E1DFDD"/>
+    </w:rPr>
+  </w:style>
 </w:styles>
 </file>
 

</xml_diff>